<commit_message>
updated HW4 and schedule
</commit_message>
<xml_diff>
--- a/docs/schedule.docx
+++ b/docs/schedule.docx
@@ -2004,6 +2004,283 @@
             <w:pPr>
               <w:pStyle w:val="Compact"/>
             </w:pPr>
+          </w:p>
+        </w:tc>
+        <w:tc>
+          <w:tcPr/>
+          <w:p>
+            <w:pPr>
+              <w:pStyle w:val="Compact"/>
+            </w:pPr>
+            <w:r>
+              <w:t xml:space="preserve">Design Presentations - Design 2 Feeding &amp; Digestion [</w:t>
+            </w:r>
+            <w:hyperlink r:id="rId59">
+              <w:r>
+                <w:rPr>
+                  <w:rStyle w:val="Hyperlink"/>
+                </w:rPr>
+                <w:t xml:space="preserve">html</w:t>
+              </w:r>
+            </w:hyperlink>
+            <w:r>
+              <w:t xml:space="preserve">] [</w:t>
+            </w:r>
+            <w:hyperlink r:id="rId60">
+              <w:r>
+                <w:rPr>
+                  <w:rStyle w:val="Hyperlink"/>
+                </w:rPr>
+                <w:t xml:space="preserve">resources</w:t>
+              </w:r>
+            </w:hyperlink>
+            <w:r>
+              <w:t xml:space="preserve">]</w:t>
+            </w:r>
+          </w:p>
+        </w:tc>
+      </w:tr>
+      <w:tr>
+        <w:tc>
+          <w:tcPr/>
+          <w:p>
+            <w:pPr>
+              <w:pStyle w:val="Compact"/>
+            </w:pPr>
+          </w:p>
+        </w:tc>
+        <w:tc>
+          <w:tcPr/>
+          <w:p>
+            <w:pPr>
+              <w:pStyle w:val="Compact"/>
+            </w:pPr>
+            <w:r>
+              <w:t xml:space="preserve">F</w:t>
+            </w:r>
+          </w:p>
+        </w:tc>
+        <w:tc>
+          <w:tcPr/>
+          <w:p>
+            <w:pPr>
+              <w:pStyle w:val="Compact"/>
+            </w:pPr>
+            <w:r>
+              <w:t xml:space="preserve">Biomechanics</w:t>
+            </w:r>
+          </w:p>
+        </w:tc>
+        <w:tc>
+          <w:tcPr/>
+          <w:p>
+            <w:pPr>
+              <w:pStyle w:val="Compact"/>
+            </w:pPr>
+            <w:r>
+              <w:t xml:space="preserve">PS4: Neurons [</w:t>
+            </w:r>
+            <w:hyperlink r:id="rId61">
+              <w:r>
+                <w:rPr>
+                  <w:rStyle w:val="Hyperlink"/>
+                </w:rPr>
+                <w:t xml:space="preserve">pdf</w:t>
+              </w:r>
+            </w:hyperlink>
+            <w:r>
+              <w:t xml:space="preserve">], Peer Critique 2 [</w:t>
+            </w:r>
+            <w:hyperlink r:id="rId62">
+              <w:r>
+                <w:rPr>
+                  <w:rStyle w:val="Hyperlink"/>
+                </w:rPr>
+                <w:t xml:space="preserve">see turn in</w:t>
+              </w:r>
+            </w:hyperlink>
+            <w:r>
+              <w:t xml:space="preserve">]</w:t>
+            </w:r>
+          </w:p>
+        </w:tc>
+        <w:tc>
+          <w:tcPr/>
+          <w:p>
+            <w:pPr>
+              <w:pStyle w:val="Compact"/>
+            </w:pPr>
+          </w:p>
+        </w:tc>
+      </w:tr>
+      <w:tr>
+        <w:tc>
+          <w:tcPr/>
+          <w:p>
+            <w:pPr>
+              <w:pStyle w:val="Compact"/>
+            </w:pPr>
+          </w:p>
+        </w:tc>
+        <w:tc>
+          <w:tcPr/>
+          <w:p>
+            <w:pPr>
+              <w:pStyle w:val="Compact"/>
+            </w:pPr>
+            <w:r>
+              <w:t xml:space="preserve">F</w:t>
+            </w:r>
+          </w:p>
+        </w:tc>
+        <w:tc>
+          <w:tcPr/>
+          <w:p>
+            <w:pPr>
+              <w:pStyle w:val="Compact"/>
+            </w:pPr>
+          </w:p>
+        </w:tc>
+        <w:tc>
+          <w:tcPr/>
+          <w:p>
+            <w:pPr>
+              <w:pStyle w:val="Compact"/>
+            </w:pPr>
+            <w:r>
+              <w:t xml:space="preserve">Design 2 Feeding &amp; Digestion (by Monday) [</w:t>
+            </w:r>
+            <w:hyperlink r:id="rId59">
+              <w:r>
+                <w:rPr>
+                  <w:rStyle w:val="Hyperlink"/>
+                </w:rPr>
+                <w:t xml:space="preserve">html</w:t>
+              </w:r>
+            </w:hyperlink>
+            <w:r>
+              <w:t xml:space="preserve">] [</w:t>
+            </w:r>
+            <w:hyperlink r:id="rId60">
+              <w:r>
+                <w:rPr>
+                  <w:rStyle w:val="Hyperlink"/>
+                </w:rPr>
+                <w:t xml:space="preserve">resources</w:t>
+              </w:r>
+            </w:hyperlink>
+            <w:r>
+              <w:t xml:space="preserve">] [</w:t>
+            </w:r>
+            <w:hyperlink r:id="rId62">
+              <w:r>
+                <w:rPr>
+                  <w:rStyle w:val="Hyperlink"/>
+                </w:rPr>
+                <w:t xml:space="preserve">turn in</w:t>
+              </w:r>
+            </w:hyperlink>
+            <w:r>
+              <w:t xml:space="preserve">]</w:t>
+            </w:r>
+          </w:p>
+        </w:tc>
+        <w:tc>
+          <w:tcPr/>
+          <w:p>
+            <w:pPr>
+              <w:pStyle w:val="Compact"/>
+            </w:pPr>
+          </w:p>
+        </w:tc>
+      </w:tr>
+      <w:tr>
+        <w:tc>
+          <w:tcPr/>
+          <w:p>
+            <w:pPr>
+              <w:pStyle w:val="Compact"/>
+            </w:pPr>
+            <w:r>
+              <w:t xml:space="preserve">Week 10</w:t>
+            </w:r>
+          </w:p>
+        </w:tc>
+        <w:tc>
+          <w:tcPr/>
+          <w:p>
+            <w:pPr>
+              <w:pStyle w:val="Compact"/>
+            </w:pPr>
+          </w:p>
+        </w:tc>
+        <w:tc>
+          <w:tcPr/>
+          <w:p>
+            <w:pPr>
+              <w:pStyle w:val="Compact"/>
+            </w:pPr>
+          </w:p>
+        </w:tc>
+        <w:tc>
+          <w:tcPr/>
+          <w:p>
+            <w:pPr>
+              <w:pStyle w:val="Compact"/>
+            </w:pPr>
+          </w:p>
+        </w:tc>
+        <w:tc>
+          <w:tcPr/>
+          <w:p>
+            <w:pPr>
+              <w:pStyle w:val="Compact"/>
+            </w:pPr>
+          </w:p>
+        </w:tc>
+      </w:tr>
+      <w:tr>
+        <w:tc>
+          <w:tcPr/>
+          <w:p>
+            <w:pPr>
+              <w:pStyle w:val="Compact"/>
+            </w:pPr>
+          </w:p>
+        </w:tc>
+        <w:tc>
+          <w:tcPr/>
+          <w:p>
+            <w:pPr>
+              <w:pStyle w:val="Compact"/>
+            </w:pPr>
+            <w:r>
+              <w:t xml:space="preserve">M</w:t>
+            </w:r>
+          </w:p>
+        </w:tc>
+        <w:tc>
+          <w:tcPr/>
+          <w:p>
+            <w:pPr>
+              <w:pStyle w:val="Compact"/>
+            </w:pPr>
+          </w:p>
+        </w:tc>
+        <w:tc>
+          <w:tcPr/>
+          <w:p>
+            <w:pPr>
+              <w:pStyle w:val="Compact"/>
+            </w:pPr>
+          </w:p>
+        </w:tc>
+        <w:tc>
+          <w:tcPr/>
+          <w:p>
+            <w:pPr>
+              <w:pStyle w:val="Compact"/>
+            </w:pPr>
             <w:r>
               <w:t xml:space="preserve">Design 2 Feeding &amp; Digestion [</w:t>
             </w:r>
@@ -2029,7 +2306,7 @@
             <w:r>
               <w:t xml:space="preserve">] [</w:t>
             </w:r>
-            <w:hyperlink r:id="rId61">
+            <w:hyperlink r:id="rId62">
               <w:r>
                 <w:rPr>
                   <w:rStyle w:val="Hyperlink"/>
@@ -2042,14 +2319,104 @@
             </w:r>
           </w:p>
         </w:tc>
-        <w:tc>
-          <w:tcPr/>
-          <w:p>
-            <w:pPr>
-              <w:pStyle w:val="Compact"/>
-            </w:pPr>
-            <w:r>
-              <w:t xml:space="preserve">Design Presentations</w:t>
+      </w:tr>
+      <w:tr>
+        <w:tc>
+          <w:tcPr/>
+          <w:p>
+            <w:pPr>
+              <w:pStyle w:val="Compact"/>
+            </w:pPr>
+            <w:r>
+              <w:t xml:space="preserve">10/29</w:t>
+            </w:r>
+          </w:p>
+        </w:tc>
+        <w:tc>
+          <w:tcPr/>
+          <w:p>
+            <w:pPr>
+              <w:pStyle w:val="Compact"/>
+            </w:pPr>
+            <w:r>
+              <w:t xml:space="preserve">W</w:t>
+            </w:r>
+          </w:p>
+        </w:tc>
+        <w:tc>
+          <w:tcPr/>
+          <w:p>
+            <w:pPr>
+              <w:pStyle w:val="Compact"/>
+            </w:pPr>
+            <w:r>
+              <w:t xml:space="preserve">Finish Muscles/Biomechanics [</w:t>
+            </w:r>
+            <w:hyperlink r:id="rId63">
+              <w:r>
+                <w:rPr>
+                  <w:rStyle w:val="Hyperlink"/>
+                </w:rPr>
+                <w:t xml:space="preserve">html</w:t>
+              </w:r>
+            </w:hyperlink>
+            <w:r>
+              <w:t xml:space="preserve">] [</w:t>
+            </w:r>
+            <w:hyperlink r:id="rId64">
+              <w:r>
+                <w:rPr>
+                  <w:rStyle w:val="Hyperlink"/>
+                </w:rPr>
+                <w:t xml:space="preserve">discussion</w:t>
+              </w:r>
+            </w:hyperlink>
+            <w:r>
+              <w:t xml:space="preserve">]</w:t>
+            </w:r>
+          </w:p>
+        </w:tc>
+        <w:tc>
+          <w:tcPr/>
+          <w:p>
+            <w:pPr>
+              <w:pStyle w:val="Compact"/>
+            </w:pPr>
+            <w:r>
+              <w:t xml:space="preserve">Peer Critique 2 [</w:t>
+            </w:r>
+            <w:hyperlink r:id="rId62">
+              <w:r>
+                <w:rPr>
+                  <w:rStyle w:val="Hyperlink"/>
+                </w:rPr>
+                <w:t xml:space="preserve">see turn in</w:t>
+              </w:r>
+            </w:hyperlink>
+            <w:r>
+              <w:t xml:space="preserve">]</w:t>
+            </w:r>
+          </w:p>
+        </w:tc>
+        <w:tc>
+          <w:tcPr/>
+          <w:p>
+            <w:pPr>
+              <w:pStyle w:val="Compact"/>
+            </w:pPr>
+            <w:r>
+              <w:t xml:space="preserve">Lab 7:PC1-G-Vertebrate Action Potential [</w:t>
+            </w:r>
+            <w:hyperlink r:id="rId65">
+              <w:r>
+                <w:rPr>
+                  <w:rStyle w:val="Hyperlink"/>
+                </w:rPr>
+                <w:t xml:space="preserve">overview</w:t>
+              </w:r>
+            </w:hyperlink>
+            <w:r>
+              <w:t xml:space="preserve">]</w:t>
             </w:r>
           </w:p>
         </w:tc>
@@ -2081,465 +2448,123 @@
               <w:pStyle w:val="Compact"/>
             </w:pPr>
             <w:r>
-              <w:t xml:space="preserve">Biomechanics</w:t>
-            </w:r>
-          </w:p>
-        </w:tc>
-        <w:tc>
-          <w:tcPr/>
-          <w:p>
-            <w:pPr>
-              <w:pStyle w:val="Compact"/>
-            </w:pPr>
-            <w:r>
-              <w:t xml:space="preserve">PS4: Neurons [</w:t>
-            </w:r>
-            <w:hyperlink r:id="rId62">
-              <w:r>
-                <w:rPr>
-                  <w:rStyle w:val="Hyperlink"/>
-                </w:rPr>
-                <w:t xml:space="preserve">pdf</w:t>
-              </w:r>
-            </w:hyperlink>
-            <w:r>
-              <w:t xml:space="preserve">], Peer Critique 2 [</w:t>
-            </w:r>
-            <w:hyperlink r:id="rId61">
-              <w:r>
-                <w:rPr>
-                  <w:rStyle w:val="Hyperlink"/>
-                </w:rPr>
-                <w:t xml:space="preserve">see turn in</w:t>
+              <w:t xml:space="preserve">Locomotion</w:t>
+            </w:r>
+          </w:p>
+        </w:tc>
+        <w:tc>
+          <w:tcPr/>
+          <w:p>
+            <w:pPr>
+              <w:pStyle w:val="Compact"/>
+            </w:pPr>
+          </w:p>
+        </w:tc>
+        <w:tc>
+          <w:tcPr/>
+          <w:p>
+            <w:pPr>
+              <w:pStyle w:val="Compact"/>
+            </w:pPr>
+          </w:p>
+        </w:tc>
+      </w:tr>
+      <w:tr>
+        <w:tc>
+          <w:tcPr/>
+          <w:p>
+            <w:pPr>
+              <w:pStyle w:val="Compact"/>
+            </w:pPr>
+            <w:r>
+              <w:t xml:space="preserve">Week 11</w:t>
+            </w:r>
+          </w:p>
+        </w:tc>
+        <w:tc>
+          <w:tcPr/>
+          <w:p>
+            <w:pPr>
+              <w:pStyle w:val="Compact"/>
+            </w:pPr>
+          </w:p>
+        </w:tc>
+        <w:tc>
+          <w:tcPr/>
+          <w:p>
+            <w:pPr>
+              <w:pStyle w:val="Compact"/>
+            </w:pPr>
+          </w:p>
+        </w:tc>
+        <w:tc>
+          <w:tcPr/>
+          <w:p>
+            <w:pPr>
+              <w:pStyle w:val="Compact"/>
+            </w:pPr>
+          </w:p>
+        </w:tc>
+        <w:tc>
+          <w:tcPr/>
+          <w:p>
+            <w:pPr>
+              <w:pStyle w:val="Compact"/>
+            </w:pPr>
+          </w:p>
+        </w:tc>
+      </w:tr>
+      <w:tr>
+        <w:tc>
+          <w:tcPr/>
+          <w:p>
+            <w:pPr>
+              <w:pStyle w:val="Compact"/>
+            </w:pPr>
+            <w:r>
+              <w:t xml:space="preserve">11/3</w:t>
+            </w:r>
+          </w:p>
+        </w:tc>
+        <w:tc>
+          <w:tcPr/>
+          <w:p>
+            <w:pPr>
+              <w:pStyle w:val="Compact"/>
+            </w:pPr>
+            <w:r>
+              <w:t xml:space="preserve">M</w:t>
+            </w:r>
+          </w:p>
+        </w:tc>
+        <w:tc>
+          <w:tcPr/>
+          <w:p>
+            <w:pPr>
+              <w:pStyle w:val="Compact"/>
+            </w:pPr>
+          </w:p>
+        </w:tc>
+        <w:tc>
+          <w:tcPr/>
+          <w:p>
+            <w:pPr>
+              <w:pStyle w:val="Compact"/>
+            </w:pPr>
+            <w:r>
+              <w:t xml:space="preserve">Rewrite Design 2 [</w:t>
+            </w:r>
+            <w:hyperlink r:id="rId66">
+              <w:r>
+                <w:rPr>
+                  <w:rStyle w:val="Hyperlink"/>
+                </w:rPr>
+                <w:t xml:space="preserve">Due Monday midnight</w:t>
               </w:r>
             </w:hyperlink>
             <w:r>
               <w:t xml:space="preserve">]</w:t>
             </w:r>
-          </w:p>
-        </w:tc>
-        <w:tc>
-          <w:tcPr/>
-          <w:p>
-            <w:pPr>
-              <w:pStyle w:val="Compact"/>
-            </w:pPr>
-          </w:p>
-        </w:tc>
-      </w:tr>
-      <w:tr>
-        <w:tc>
-          <w:tcPr/>
-          <w:p>
-            <w:pPr>
-              <w:pStyle w:val="Compact"/>
-            </w:pPr>
-          </w:p>
-        </w:tc>
-        <w:tc>
-          <w:tcPr/>
-          <w:p>
-            <w:pPr>
-              <w:pStyle w:val="Compact"/>
-            </w:pPr>
-            <w:r>
-              <w:t xml:space="preserve">F</w:t>
-            </w:r>
-          </w:p>
-        </w:tc>
-        <w:tc>
-          <w:tcPr/>
-          <w:p>
-            <w:pPr>
-              <w:pStyle w:val="Compact"/>
-            </w:pPr>
-          </w:p>
-        </w:tc>
-        <w:tc>
-          <w:tcPr/>
-          <w:p>
-            <w:pPr>
-              <w:pStyle w:val="Compact"/>
-            </w:pPr>
-            <w:r>
-              <w:t xml:space="preserve">Design 2 Feeding &amp; Digestion [</w:t>
-            </w:r>
-            <w:hyperlink r:id="rId59">
-              <w:r>
-                <w:rPr>
-                  <w:rStyle w:val="Hyperlink"/>
-                </w:rPr>
-                <w:t xml:space="preserve">html</w:t>
-              </w:r>
-            </w:hyperlink>
-            <w:r>
-              <w:t xml:space="preserve">] [</w:t>
-            </w:r>
-            <w:hyperlink r:id="rId60">
-              <w:r>
-                <w:rPr>
-                  <w:rStyle w:val="Hyperlink"/>
-                </w:rPr>
-                <w:t xml:space="preserve">resources</w:t>
-              </w:r>
-            </w:hyperlink>
-            <w:r>
-              <w:t xml:space="preserve">] [</w:t>
-            </w:r>
-            <w:hyperlink r:id="rId61">
-              <w:r>
-                <w:rPr>
-                  <w:rStyle w:val="Hyperlink"/>
-                </w:rPr>
-                <w:t xml:space="preserve">turn in</w:t>
-              </w:r>
-            </w:hyperlink>
-            <w:r>
-              <w:t xml:space="preserve">]</w:t>
-            </w:r>
-          </w:p>
-        </w:tc>
-        <w:tc>
-          <w:tcPr/>
-          <w:p>
-            <w:pPr>
-              <w:pStyle w:val="Compact"/>
-            </w:pPr>
-          </w:p>
-        </w:tc>
-      </w:tr>
-      <w:tr>
-        <w:tc>
-          <w:tcPr/>
-          <w:p>
-            <w:pPr>
-              <w:pStyle w:val="Compact"/>
-            </w:pPr>
-            <w:r>
-              <w:t xml:space="preserve">Week 10</w:t>
-            </w:r>
-          </w:p>
-        </w:tc>
-        <w:tc>
-          <w:tcPr/>
-          <w:p>
-            <w:pPr>
-              <w:pStyle w:val="Compact"/>
-            </w:pPr>
-          </w:p>
-        </w:tc>
-        <w:tc>
-          <w:tcPr/>
-          <w:p>
-            <w:pPr>
-              <w:pStyle w:val="Compact"/>
-            </w:pPr>
-          </w:p>
-        </w:tc>
-        <w:tc>
-          <w:tcPr/>
-          <w:p>
-            <w:pPr>
-              <w:pStyle w:val="Compact"/>
-            </w:pPr>
-          </w:p>
-        </w:tc>
-        <w:tc>
-          <w:tcPr/>
-          <w:p>
-            <w:pPr>
-              <w:pStyle w:val="Compact"/>
-            </w:pPr>
-          </w:p>
-        </w:tc>
-      </w:tr>
-      <w:tr>
-        <w:tc>
-          <w:tcPr/>
-          <w:p>
-            <w:pPr>
-              <w:pStyle w:val="Compact"/>
-            </w:pPr>
-          </w:p>
-        </w:tc>
-        <w:tc>
-          <w:tcPr/>
-          <w:p>
-            <w:pPr>
-              <w:pStyle w:val="Compact"/>
-            </w:pPr>
-            <w:r>
-              <w:t xml:space="preserve">M</w:t>
-            </w:r>
-          </w:p>
-        </w:tc>
-        <w:tc>
-          <w:tcPr/>
-          <w:p>
-            <w:pPr>
-              <w:pStyle w:val="Compact"/>
-            </w:pPr>
-          </w:p>
-        </w:tc>
-        <w:tc>
-          <w:tcPr/>
-          <w:p>
-            <w:pPr>
-              <w:pStyle w:val="Compact"/>
-            </w:pPr>
-            <w:r>
-              <w:t xml:space="preserve">Peer Critique 2 [</w:t>
-            </w:r>
-            <w:hyperlink r:id="rId61">
-              <w:r>
-                <w:rPr>
-                  <w:rStyle w:val="Hyperlink"/>
-                </w:rPr>
-                <w:t xml:space="preserve">see turn in</w:t>
-              </w:r>
-            </w:hyperlink>
-            <w:r>
-              <w:t xml:space="preserve">]</w:t>
-            </w:r>
-          </w:p>
-        </w:tc>
-        <w:tc>
-          <w:tcPr/>
-          <w:p>
-            <w:pPr>
-              <w:pStyle w:val="Compact"/>
-            </w:pPr>
-          </w:p>
-        </w:tc>
-      </w:tr>
-      <w:tr>
-        <w:tc>
-          <w:tcPr/>
-          <w:p>
-            <w:pPr>
-              <w:pStyle w:val="Compact"/>
-            </w:pPr>
-            <w:r>
-              <w:t xml:space="preserve">10/29</w:t>
-            </w:r>
-          </w:p>
-        </w:tc>
-        <w:tc>
-          <w:tcPr/>
-          <w:p>
-            <w:pPr>
-              <w:pStyle w:val="Compact"/>
-            </w:pPr>
-            <w:r>
-              <w:t xml:space="preserve">W</w:t>
-            </w:r>
-          </w:p>
-        </w:tc>
-        <w:tc>
-          <w:tcPr/>
-          <w:p>
-            <w:pPr>
-              <w:pStyle w:val="Compact"/>
-            </w:pPr>
-            <w:r>
-              <w:t xml:space="preserve">Finish Muscles/Biomechanics [</w:t>
-            </w:r>
-            <w:hyperlink r:id="rId63">
-              <w:r>
-                <w:rPr>
-                  <w:rStyle w:val="Hyperlink"/>
-                </w:rPr>
-                <w:t xml:space="preserve">html</w:t>
-              </w:r>
-            </w:hyperlink>
-            <w:r>
-              <w:t xml:space="preserve">] [</w:t>
-            </w:r>
-            <w:hyperlink r:id="rId64">
-              <w:r>
-                <w:rPr>
-                  <w:rStyle w:val="Hyperlink"/>
-                </w:rPr>
-                <w:t xml:space="preserve">discussion</w:t>
-              </w:r>
-            </w:hyperlink>
-            <w:r>
-              <w:t xml:space="preserve">]</w:t>
-            </w:r>
-          </w:p>
-        </w:tc>
-        <w:tc>
-          <w:tcPr/>
-          <w:p>
-            <w:pPr>
-              <w:pStyle w:val="Compact"/>
-            </w:pPr>
-          </w:p>
-        </w:tc>
-        <w:tc>
-          <w:tcPr/>
-          <w:p>
-            <w:pPr>
-              <w:pStyle w:val="Compact"/>
-            </w:pPr>
-            <w:r>
-              <w:t xml:space="preserve">Lab 7:PC1-G-Vertebrate Action Potential [</w:t>
-            </w:r>
-            <w:hyperlink r:id="rId65">
-              <w:r>
-                <w:rPr>
-                  <w:rStyle w:val="Hyperlink"/>
-                </w:rPr>
-                <w:t xml:space="preserve">overview</w:t>
-              </w:r>
-            </w:hyperlink>
-            <w:r>
-              <w:t xml:space="preserve">]</w:t>
-            </w:r>
-          </w:p>
-        </w:tc>
-      </w:tr>
-      <w:tr>
-        <w:tc>
-          <w:tcPr/>
-          <w:p>
-            <w:pPr>
-              <w:pStyle w:val="Compact"/>
-            </w:pPr>
-          </w:p>
-        </w:tc>
-        <w:tc>
-          <w:tcPr/>
-          <w:p>
-            <w:pPr>
-              <w:pStyle w:val="Compact"/>
-            </w:pPr>
-            <w:r>
-              <w:t xml:space="preserve">F</w:t>
-            </w:r>
-          </w:p>
-        </w:tc>
-        <w:tc>
-          <w:tcPr/>
-          <w:p>
-            <w:pPr>
-              <w:pStyle w:val="Compact"/>
-            </w:pPr>
-            <w:r>
-              <w:t xml:space="preserve">Locomotion</w:t>
-            </w:r>
-          </w:p>
-        </w:tc>
-        <w:tc>
-          <w:tcPr/>
-          <w:p>
-            <w:pPr>
-              <w:pStyle w:val="Compact"/>
-            </w:pPr>
-          </w:p>
-        </w:tc>
-        <w:tc>
-          <w:tcPr/>
-          <w:p>
-            <w:pPr>
-              <w:pStyle w:val="Compact"/>
-            </w:pPr>
-          </w:p>
-        </w:tc>
-      </w:tr>
-      <w:tr>
-        <w:tc>
-          <w:tcPr/>
-          <w:p>
-            <w:pPr>
-              <w:pStyle w:val="Compact"/>
-            </w:pPr>
-          </w:p>
-        </w:tc>
-        <w:tc>
-          <w:tcPr/>
-          <w:p>
-            <w:pPr>
-              <w:pStyle w:val="Compact"/>
-            </w:pPr>
-            <w:r>
-              <w:t xml:space="preserve">F</w:t>
-            </w:r>
-          </w:p>
-        </w:tc>
-        <w:tc>
-          <w:tcPr/>
-          <w:p>
-            <w:pPr>
-              <w:pStyle w:val="Compact"/>
-            </w:pPr>
-          </w:p>
-        </w:tc>
-        <w:tc>
-          <w:tcPr/>
-          <w:p>
-            <w:pPr>
-              <w:pStyle w:val="Compact"/>
-            </w:pPr>
-            <w:r>
-              <w:t xml:space="preserve">Rewrite Design 2 [</w:t>
-            </w:r>
-            <w:hyperlink r:id="rId66">
-              <w:r>
-                <w:rPr>
-                  <w:rStyle w:val="Hyperlink"/>
-                </w:rPr>
-                <w:t xml:space="preserve">Due Friday midnight</w:t>
-              </w:r>
-            </w:hyperlink>
-            <w:r>
-              <w:t xml:space="preserve">]</w:t>
-            </w:r>
-          </w:p>
-        </w:tc>
-        <w:tc>
-          <w:tcPr/>
-          <w:p>
-            <w:pPr>
-              <w:pStyle w:val="Compact"/>
-            </w:pPr>
-          </w:p>
-        </w:tc>
-      </w:tr>
-      <w:tr>
-        <w:tc>
-          <w:tcPr/>
-          <w:p>
-            <w:pPr>
-              <w:pStyle w:val="Compact"/>
-            </w:pPr>
-            <w:r>
-              <w:t xml:space="preserve">Week 11</w:t>
-            </w:r>
-          </w:p>
-        </w:tc>
-        <w:tc>
-          <w:tcPr/>
-          <w:p>
-            <w:pPr>
-              <w:pStyle w:val="Compact"/>
-            </w:pPr>
-          </w:p>
-        </w:tc>
-        <w:tc>
-          <w:tcPr/>
-          <w:p>
-            <w:pPr>
-              <w:pStyle w:val="Compact"/>
-            </w:pPr>
-          </w:p>
-        </w:tc>
-        <w:tc>
-          <w:tcPr/>
-          <w:p>
-            <w:pPr>
-              <w:pStyle w:val="Compact"/>
-            </w:pPr>
           </w:p>
         </w:tc>
         <w:tc>

</xml_diff>

<commit_message>
updated week 9 and schedule
</commit_message>
<xml_diff>
--- a/docs/schedule.docx
+++ b/docs/schedule.docx
@@ -1792,6 +1792,68 @@
               <w:pStyle w:val="Compact"/>
             </w:pPr>
             <w:r>
+              <w:t xml:space="preserve">Neurons/Synapses</w:t>
+            </w:r>
+          </w:p>
+        </w:tc>
+        <w:tc>
+          <w:tcPr/>
+          <w:p>
+            <w:pPr>
+              <w:pStyle w:val="Compact"/>
+            </w:pPr>
+          </w:p>
+        </w:tc>
+        <w:tc>
+          <w:tcPr/>
+          <w:p>
+            <w:pPr>
+              <w:pStyle w:val="Compact"/>
+            </w:pPr>
+            <w:r>
+              <w:t xml:space="preserve">Lab8: PC2-G-Human Muscle [</w:t>
+            </w:r>
+            <w:hyperlink r:id="rId56">
+              <w:r>
+                <w:rPr>
+                  <w:rStyle w:val="Hyperlink"/>
+                </w:rPr>
+                <w:t xml:space="preserve">overview</w:t>
+              </w:r>
+            </w:hyperlink>
+            <w:r>
+              <w:t xml:space="preserve">]</w:t>
+            </w:r>
+          </w:p>
+        </w:tc>
+      </w:tr>
+      <w:tr>
+        <w:tc>
+          <w:tcPr/>
+          <w:p>
+            <w:pPr>
+              <w:pStyle w:val="Compact"/>
+            </w:pPr>
+          </w:p>
+        </w:tc>
+        <w:tc>
+          <w:tcPr/>
+          <w:p>
+            <w:pPr>
+              <w:pStyle w:val="Compact"/>
+            </w:pPr>
+            <w:r>
+              <w:t xml:space="preserve">F</w:t>
+            </w:r>
+          </w:p>
+        </w:tc>
+        <w:tc>
+          <w:tcPr/>
+          <w:p>
+            <w:pPr>
+              <w:pStyle w:val="Compact"/>
+            </w:pPr>
+            <w:r>
               <w:t xml:space="preserve">Synapses/Sensory Receptors</w:t>
             </w:r>
           </w:p>
@@ -1834,6 +1896,149 @@
             <w:pPr>
               <w:pStyle w:val="Compact"/>
             </w:pPr>
+            <w:r>
+              <w:t xml:space="preserve">Week 9</w:t>
+            </w:r>
+          </w:p>
+        </w:tc>
+        <w:tc>
+          <w:tcPr/>
+          <w:p>
+            <w:pPr>
+              <w:pStyle w:val="Compact"/>
+            </w:pPr>
+          </w:p>
+        </w:tc>
+        <w:tc>
+          <w:tcPr/>
+          <w:p>
+            <w:pPr>
+              <w:pStyle w:val="Compact"/>
+            </w:pPr>
+          </w:p>
+        </w:tc>
+        <w:tc>
+          <w:tcPr/>
+          <w:p>
+            <w:pPr>
+              <w:pStyle w:val="Compact"/>
+            </w:pPr>
+          </w:p>
+        </w:tc>
+        <w:tc>
+          <w:tcPr/>
+          <w:p>
+            <w:pPr>
+              <w:pStyle w:val="Compact"/>
+            </w:pPr>
+          </w:p>
+        </w:tc>
+      </w:tr>
+      <w:tr>
+        <w:tc>
+          <w:tcPr/>
+          <w:p>
+            <w:pPr>
+              <w:pStyle w:val="Compact"/>
+            </w:pPr>
+            <w:r>
+              <w:t xml:space="preserve">10/22</w:t>
+            </w:r>
+          </w:p>
+        </w:tc>
+        <w:tc>
+          <w:tcPr/>
+          <w:p>
+            <w:pPr>
+              <w:pStyle w:val="Compact"/>
+            </w:pPr>
+            <w:r>
+              <w:t xml:space="preserve">W</w:t>
+            </w:r>
+          </w:p>
+        </w:tc>
+        <w:tc>
+          <w:tcPr/>
+          <w:p>
+            <w:pPr>
+              <w:pStyle w:val="Compact"/>
+            </w:pPr>
+            <w:r>
+              <w:t xml:space="preserve">Muscles [</w:t>
+            </w:r>
+            <w:hyperlink r:id="rId57">
+              <w:r>
+                <w:rPr>
+                  <w:rStyle w:val="Hyperlink"/>
+                </w:rPr>
+                <w:t xml:space="preserve">html</w:t>
+              </w:r>
+            </w:hyperlink>
+            <w:r>
+              <w:t xml:space="preserve">] [</w:t>
+            </w:r>
+            <w:hyperlink r:id="rId58">
+              <w:r>
+                <w:rPr>
+                  <w:rStyle w:val="Hyperlink"/>
+                </w:rPr>
+                <w:t xml:space="preserve">discussion</w:t>
+              </w:r>
+            </w:hyperlink>
+            <w:r>
+              <w:t xml:space="preserve">]</w:t>
+            </w:r>
+          </w:p>
+        </w:tc>
+        <w:tc>
+          <w:tcPr/>
+          <w:p>
+            <w:pPr>
+              <w:pStyle w:val="Compact"/>
+            </w:pPr>
+          </w:p>
+        </w:tc>
+        <w:tc>
+          <w:tcPr/>
+          <w:p>
+            <w:pPr>
+              <w:pStyle w:val="Compact"/>
+            </w:pPr>
+            <w:r>
+              <w:t xml:space="preserve">Design Presentations - Design 2 Feeding &amp; Digestion [</w:t>
+            </w:r>
+            <w:hyperlink r:id="rId59">
+              <w:r>
+                <w:rPr>
+                  <w:rStyle w:val="Hyperlink"/>
+                </w:rPr>
+                <w:t xml:space="preserve">html</w:t>
+              </w:r>
+            </w:hyperlink>
+            <w:r>
+              <w:t xml:space="preserve">] [</w:t>
+            </w:r>
+            <w:hyperlink r:id="rId60">
+              <w:r>
+                <w:rPr>
+                  <w:rStyle w:val="Hyperlink"/>
+                </w:rPr>
+                <w:t xml:space="preserve">resources</w:t>
+              </w:r>
+            </w:hyperlink>
+            <w:r>
+              <w:t xml:space="preserve">]</w:t>
+            </w:r>
+          </w:p>
+        </w:tc>
+      </w:tr>
+      <w:tr>
+        <w:tc>
+          <w:tcPr/>
+          <w:p>
+            <w:pPr>
+              <w:pStyle w:val="Compact"/>
+            </w:pPr>
           </w:p>
         </w:tc>
         <w:tc>
@@ -1854,220 +2059,7 @@
               <w:pStyle w:val="Compact"/>
             </w:pPr>
             <w:r>
-              <w:t xml:space="preserve">Muscles [</w:t>
-            </w:r>
-            <w:hyperlink r:id="rId57">
-              <w:r>
-                <w:rPr>
-                  <w:rStyle w:val="Hyperlink"/>
-                </w:rPr>
-                <w:t xml:space="preserve">html</w:t>
-              </w:r>
-            </w:hyperlink>
-            <w:r>
-              <w:t xml:space="preserve">] [</w:t>
-            </w:r>
-            <w:hyperlink r:id="rId58">
-              <w:r>
-                <w:rPr>
-                  <w:rStyle w:val="Hyperlink"/>
-                </w:rPr>
-                <w:t xml:space="preserve">discussion</w:t>
-              </w:r>
-            </w:hyperlink>
-            <w:r>
-              <w:t xml:space="preserve">]</w:t>
-            </w:r>
-          </w:p>
-        </w:tc>
-        <w:tc>
-          <w:tcPr/>
-          <w:p>
-            <w:pPr>
-              <w:pStyle w:val="Compact"/>
-            </w:pPr>
-          </w:p>
-        </w:tc>
-        <w:tc>
-          <w:tcPr/>
-          <w:p>
-            <w:pPr>
-              <w:pStyle w:val="Compact"/>
-            </w:pPr>
-          </w:p>
-        </w:tc>
-      </w:tr>
-      <w:tr>
-        <w:tc>
-          <w:tcPr/>
-          <w:p>
-            <w:pPr>
-              <w:pStyle w:val="Compact"/>
-            </w:pPr>
-            <w:r>
-              <w:t xml:space="preserve">Week 9</w:t>
-            </w:r>
-          </w:p>
-        </w:tc>
-        <w:tc>
-          <w:tcPr/>
-          <w:p>
-            <w:pPr>
-              <w:pStyle w:val="Compact"/>
-            </w:pPr>
-          </w:p>
-        </w:tc>
-        <w:tc>
-          <w:tcPr/>
-          <w:p>
-            <w:pPr>
-              <w:pStyle w:val="Compact"/>
-            </w:pPr>
-          </w:p>
-        </w:tc>
-        <w:tc>
-          <w:tcPr/>
-          <w:p>
-            <w:pPr>
-              <w:pStyle w:val="Compact"/>
-            </w:pPr>
-          </w:p>
-        </w:tc>
-        <w:tc>
-          <w:tcPr/>
-          <w:p>
-            <w:pPr>
-              <w:pStyle w:val="Compact"/>
-            </w:pPr>
-          </w:p>
-        </w:tc>
-      </w:tr>
-      <w:tr>
-        <w:tc>
-          <w:tcPr/>
-          <w:p>
-            <w:pPr>
-              <w:pStyle w:val="Compact"/>
-            </w:pPr>
-            <w:r>
-              <w:t xml:space="preserve">10/22</w:t>
-            </w:r>
-          </w:p>
-        </w:tc>
-        <w:tc>
-          <w:tcPr/>
-          <w:p>
-            <w:pPr>
-              <w:pStyle w:val="Compact"/>
-            </w:pPr>
-            <w:r>
-              <w:t xml:space="preserve">W</w:t>
-            </w:r>
-          </w:p>
-        </w:tc>
-        <w:tc>
-          <w:tcPr/>
-          <w:p>
-            <w:pPr>
-              <w:pStyle w:val="Compact"/>
-            </w:pPr>
-            <w:r>
-              <w:t xml:space="preserve">Motor Control [</w:t>
-            </w:r>
-            <w:hyperlink r:id="rId57">
-              <w:r>
-                <w:rPr>
-                  <w:rStyle w:val="Hyperlink"/>
-                </w:rPr>
-                <w:t xml:space="preserve">html</w:t>
-              </w:r>
-            </w:hyperlink>
-            <w:r>
-              <w:t xml:space="preserve">] [</w:t>
-            </w:r>
-            <w:hyperlink r:id="rId58">
-              <w:r>
-                <w:rPr>
-                  <w:rStyle w:val="Hyperlink"/>
-                </w:rPr>
-                <w:t xml:space="preserve">discussion</w:t>
-              </w:r>
-            </w:hyperlink>
-            <w:r>
-              <w:t xml:space="preserve">]</w:t>
-            </w:r>
-          </w:p>
-        </w:tc>
-        <w:tc>
-          <w:tcPr/>
-          <w:p>
-            <w:pPr>
-              <w:pStyle w:val="Compact"/>
-            </w:pPr>
-          </w:p>
-        </w:tc>
-        <w:tc>
-          <w:tcPr/>
-          <w:p>
-            <w:pPr>
-              <w:pStyle w:val="Compact"/>
-            </w:pPr>
-            <w:r>
-              <w:t xml:space="preserve">Design Presentations - Design 2 Feeding &amp; Digestion [</w:t>
-            </w:r>
-            <w:hyperlink r:id="rId59">
-              <w:r>
-                <w:rPr>
-                  <w:rStyle w:val="Hyperlink"/>
-                </w:rPr>
-                <w:t xml:space="preserve">html</w:t>
-              </w:r>
-            </w:hyperlink>
-            <w:r>
-              <w:t xml:space="preserve">] [</w:t>
-            </w:r>
-            <w:hyperlink r:id="rId60">
-              <w:r>
-                <w:rPr>
-                  <w:rStyle w:val="Hyperlink"/>
-                </w:rPr>
-                <w:t xml:space="preserve">resources</w:t>
-              </w:r>
-            </w:hyperlink>
-            <w:r>
-              <w:t xml:space="preserve">]</w:t>
-            </w:r>
-          </w:p>
-        </w:tc>
-      </w:tr>
-      <w:tr>
-        <w:tc>
-          <w:tcPr/>
-          <w:p>
-            <w:pPr>
-              <w:pStyle w:val="Compact"/>
-            </w:pPr>
-          </w:p>
-        </w:tc>
-        <w:tc>
-          <w:tcPr/>
-          <w:p>
-            <w:pPr>
-              <w:pStyle w:val="Compact"/>
-            </w:pPr>
-            <w:r>
-              <w:t xml:space="preserve">F</w:t>
-            </w:r>
-          </w:p>
-        </w:tc>
-        <w:tc>
-          <w:tcPr/>
-          <w:p>
-            <w:pPr>
-              <w:pStyle w:val="Compact"/>
-            </w:pPr>
-            <w:r>
-              <w:t xml:space="preserve">Biomechanics</w:t>
+              <w:t xml:space="preserve">Motor Control</w:t>
             </w:r>
           </w:p>
         </w:tc>
@@ -2089,66 +2081,7 @@
               </w:r>
             </w:hyperlink>
             <w:r>
-              <w:t xml:space="preserve">], Peer Critique 2 [</w:t>
-            </w:r>
-            <w:hyperlink r:id="rId62">
-              <w:r>
-                <w:rPr>
-                  <w:rStyle w:val="Hyperlink"/>
-                </w:rPr>
-                <w:t xml:space="preserve">see turn in</w:t>
-              </w:r>
-            </w:hyperlink>
-            <w:r>
-              <w:t xml:space="preserve">]</w:t>
-            </w:r>
-          </w:p>
-        </w:tc>
-        <w:tc>
-          <w:tcPr/>
-          <w:p>
-            <w:pPr>
-              <w:pStyle w:val="Compact"/>
-            </w:pPr>
-          </w:p>
-        </w:tc>
-      </w:tr>
-      <w:tr>
-        <w:tc>
-          <w:tcPr/>
-          <w:p>
-            <w:pPr>
-              <w:pStyle w:val="Compact"/>
-            </w:pPr>
-          </w:p>
-        </w:tc>
-        <w:tc>
-          <w:tcPr/>
-          <w:p>
-            <w:pPr>
-              <w:pStyle w:val="Compact"/>
-            </w:pPr>
-            <w:r>
-              <w:t xml:space="preserve">F</w:t>
-            </w:r>
-          </w:p>
-        </w:tc>
-        <w:tc>
-          <w:tcPr/>
-          <w:p>
-            <w:pPr>
-              <w:pStyle w:val="Compact"/>
-            </w:pPr>
-          </w:p>
-        </w:tc>
-        <w:tc>
-          <w:tcPr/>
-          <w:p>
-            <w:pPr>
-              <w:pStyle w:val="Compact"/>
-            </w:pPr>
-            <w:r>
-              <w:t xml:space="preserve">Design 2 Feeding &amp; Digestion (by Monday) [</w:t>
+              <w:t xml:space="preserve">] Design 2 Feeding &amp; Digestion (by Monday, but first-in, first-out) [</w:t>
             </w:r>
             <w:hyperlink r:id="rId59">
               <w:r>

</xml_diff>

<commit_message>
updated Design 2, HW4
</commit_message>
<xml_diff>
--- a/docs/schedule.docx
+++ b/docs/schedule.docx
@@ -2485,197 +2485,197 @@
               <w:pStyle w:val="Compact"/>
             </w:pPr>
             <w:r>
+              <w:t xml:space="preserve">PS5: Muscles &amp; Biomech [</w:t>
+            </w:r>
+            <w:hyperlink r:id="rId66">
+              <w:r>
+                <w:rPr>
+                  <w:rStyle w:val="Hyperlink"/>
+                </w:rPr>
+                <w:t xml:space="preserve">pdf</w:t>
+              </w:r>
+            </w:hyperlink>
+            <w:r>
+              <w:t xml:space="preserve">]</w:t>
+            </w:r>
+          </w:p>
+        </w:tc>
+        <w:tc>
+          <w:tcPr/>
+          <w:p>
+            <w:pPr>
+              <w:pStyle w:val="Compact"/>
+            </w:pPr>
+          </w:p>
+        </w:tc>
+      </w:tr>
+      <w:tr>
+        <w:tc>
+          <w:tcPr/>
+          <w:p>
+            <w:pPr>
+              <w:pStyle w:val="Compact"/>
+            </w:pPr>
+            <w:r>
+              <w:t xml:space="preserve">11/5</w:t>
+            </w:r>
+          </w:p>
+        </w:tc>
+        <w:tc>
+          <w:tcPr/>
+          <w:p>
+            <w:pPr>
+              <w:pStyle w:val="Compact"/>
+            </w:pPr>
+            <w:r>
+              <w:t xml:space="preserve">W</w:t>
+            </w:r>
+          </w:p>
+        </w:tc>
+        <w:tc>
+          <w:tcPr/>
+          <w:p>
+            <w:pPr>
+              <w:pStyle w:val="Compact"/>
+            </w:pPr>
+            <w:r>
+              <w:t xml:space="preserve">Blood and Respiration [</w:t>
+            </w:r>
+            <w:hyperlink r:id="rId67">
+              <w:r>
+                <w:rPr>
+                  <w:rStyle w:val="Hyperlink"/>
+                </w:rPr>
+                <w:t xml:space="preserve">html</w:t>
+              </w:r>
+            </w:hyperlink>
+            <w:r>
+              <w:t xml:space="preserve">]</w:t>
+            </w:r>
+          </w:p>
+        </w:tc>
+        <w:tc>
+          <w:tcPr/>
+          <w:p>
+            <w:pPr>
+              <w:pStyle w:val="Compact"/>
+            </w:pPr>
+          </w:p>
+        </w:tc>
+        <w:tc>
+          <w:tcPr/>
+          <w:p>
+            <w:pPr>
+              <w:pStyle w:val="Compact"/>
+            </w:pPr>
+            <w:r>
+              <w:t xml:space="preserve">Lab9: PC3-G-Toad Muscle [</w:t>
+            </w:r>
+            <w:hyperlink r:id="rId68">
+              <w:r>
+                <w:rPr>
+                  <w:rStyle w:val="Hyperlink"/>
+                </w:rPr>
+                <w:t xml:space="preserve">overview</w:t>
+              </w:r>
+            </w:hyperlink>
+            <w:r>
+              <w:t xml:space="preserve">]</w:t>
+            </w:r>
+          </w:p>
+        </w:tc>
+      </w:tr>
+      <w:tr>
+        <w:tc>
+          <w:tcPr/>
+          <w:p>
+            <w:pPr>
+              <w:pStyle w:val="Compact"/>
+            </w:pPr>
+          </w:p>
+        </w:tc>
+        <w:tc>
+          <w:tcPr/>
+          <w:p>
+            <w:pPr>
+              <w:pStyle w:val="Compact"/>
+            </w:pPr>
+            <w:r>
+              <w:t xml:space="preserve">F</w:t>
+            </w:r>
+          </w:p>
+        </w:tc>
+        <w:tc>
+          <w:tcPr/>
+          <w:p>
+            <w:pPr>
+              <w:pStyle w:val="Compact"/>
+            </w:pPr>
+            <w:r>
+              <w:t xml:space="preserve">Blood and Respiration</w:t>
+            </w:r>
+          </w:p>
+        </w:tc>
+        <w:tc>
+          <w:tcPr/>
+          <w:p>
+            <w:pPr>
+              <w:pStyle w:val="Compact"/>
+            </w:pPr>
+          </w:p>
+        </w:tc>
+        <w:tc>
+          <w:tcPr/>
+          <w:p>
+            <w:pPr>
+              <w:pStyle w:val="Compact"/>
+            </w:pPr>
+          </w:p>
+        </w:tc>
+      </w:tr>
+      <w:tr>
+        <w:tc>
+          <w:tcPr/>
+          <w:p>
+            <w:pPr>
+              <w:pStyle w:val="Compact"/>
+            </w:pPr>
+          </w:p>
+        </w:tc>
+        <w:tc>
+          <w:tcPr/>
+          <w:p>
+            <w:pPr>
+              <w:pStyle w:val="Compact"/>
+            </w:pPr>
+            <w:r>
+              <w:t xml:space="preserve">F</w:t>
+            </w:r>
+          </w:p>
+        </w:tc>
+        <w:tc>
+          <w:tcPr/>
+          <w:p>
+            <w:pPr>
+              <w:pStyle w:val="Compact"/>
+            </w:pPr>
+          </w:p>
+        </w:tc>
+        <w:tc>
+          <w:tcPr/>
+          <w:p>
+            <w:pPr>
+              <w:pStyle w:val="Compact"/>
+            </w:pPr>
+            <w:r>
               <w:t xml:space="preserve">Rewrite Design 2 [</w:t>
             </w:r>
-            <w:hyperlink r:id="rId66">
+            <w:hyperlink r:id="rId69">
               <w:r>
                 <w:rPr>
                   <w:rStyle w:val="Hyperlink"/>
                 </w:rPr>
                 <w:t xml:space="preserve">Due Monday midnight</w:t>
-              </w:r>
-            </w:hyperlink>
-            <w:r>
-              <w:t xml:space="preserve">]</w:t>
-            </w:r>
-          </w:p>
-        </w:tc>
-        <w:tc>
-          <w:tcPr/>
-          <w:p>
-            <w:pPr>
-              <w:pStyle w:val="Compact"/>
-            </w:pPr>
-          </w:p>
-        </w:tc>
-      </w:tr>
-      <w:tr>
-        <w:tc>
-          <w:tcPr/>
-          <w:p>
-            <w:pPr>
-              <w:pStyle w:val="Compact"/>
-            </w:pPr>
-            <w:r>
-              <w:t xml:space="preserve">11/5</w:t>
-            </w:r>
-          </w:p>
-        </w:tc>
-        <w:tc>
-          <w:tcPr/>
-          <w:p>
-            <w:pPr>
-              <w:pStyle w:val="Compact"/>
-            </w:pPr>
-            <w:r>
-              <w:t xml:space="preserve">W</w:t>
-            </w:r>
-          </w:p>
-        </w:tc>
-        <w:tc>
-          <w:tcPr/>
-          <w:p>
-            <w:pPr>
-              <w:pStyle w:val="Compact"/>
-            </w:pPr>
-            <w:r>
-              <w:t xml:space="preserve">Blood and Respiration [</w:t>
-            </w:r>
-            <w:hyperlink r:id="rId67">
-              <w:r>
-                <w:rPr>
-                  <w:rStyle w:val="Hyperlink"/>
-                </w:rPr>
-                <w:t xml:space="preserve">html</w:t>
-              </w:r>
-            </w:hyperlink>
-            <w:r>
-              <w:t xml:space="preserve">]</w:t>
-            </w:r>
-          </w:p>
-        </w:tc>
-        <w:tc>
-          <w:tcPr/>
-          <w:p>
-            <w:pPr>
-              <w:pStyle w:val="Compact"/>
-            </w:pPr>
-          </w:p>
-        </w:tc>
-        <w:tc>
-          <w:tcPr/>
-          <w:p>
-            <w:pPr>
-              <w:pStyle w:val="Compact"/>
-            </w:pPr>
-            <w:r>
-              <w:t xml:space="preserve">Lab9: PC3-G-Toad Muscle [</w:t>
-            </w:r>
-            <w:hyperlink r:id="rId68">
-              <w:r>
-                <w:rPr>
-                  <w:rStyle w:val="Hyperlink"/>
-                </w:rPr>
-                <w:t xml:space="preserve">overview</w:t>
-              </w:r>
-            </w:hyperlink>
-            <w:r>
-              <w:t xml:space="preserve">]</w:t>
-            </w:r>
-          </w:p>
-        </w:tc>
-      </w:tr>
-      <w:tr>
-        <w:tc>
-          <w:tcPr/>
-          <w:p>
-            <w:pPr>
-              <w:pStyle w:val="Compact"/>
-            </w:pPr>
-          </w:p>
-        </w:tc>
-        <w:tc>
-          <w:tcPr/>
-          <w:p>
-            <w:pPr>
-              <w:pStyle w:val="Compact"/>
-            </w:pPr>
-            <w:r>
-              <w:t xml:space="preserve">F</w:t>
-            </w:r>
-          </w:p>
-        </w:tc>
-        <w:tc>
-          <w:tcPr/>
-          <w:p>
-            <w:pPr>
-              <w:pStyle w:val="Compact"/>
-            </w:pPr>
-            <w:r>
-              <w:t xml:space="preserve">Blood and Respiration</w:t>
-            </w:r>
-          </w:p>
-        </w:tc>
-        <w:tc>
-          <w:tcPr/>
-          <w:p>
-            <w:pPr>
-              <w:pStyle w:val="Compact"/>
-            </w:pPr>
-          </w:p>
-        </w:tc>
-        <w:tc>
-          <w:tcPr/>
-          <w:p>
-            <w:pPr>
-              <w:pStyle w:val="Compact"/>
-            </w:pPr>
-          </w:p>
-        </w:tc>
-      </w:tr>
-      <w:tr>
-        <w:tc>
-          <w:tcPr/>
-          <w:p>
-            <w:pPr>
-              <w:pStyle w:val="Compact"/>
-            </w:pPr>
-          </w:p>
-        </w:tc>
-        <w:tc>
-          <w:tcPr/>
-          <w:p>
-            <w:pPr>
-              <w:pStyle w:val="Compact"/>
-            </w:pPr>
-            <w:r>
-              <w:t xml:space="preserve">F</w:t>
-            </w:r>
-          </w:p>
-        </w:tc>
-        <w:tc>
-          <w:tcPr/>
-          <w:p>
-            <w:pPr>
-              <w:pStyle w:val="Compact"/>
-            </w:pPr>
-          </w:p>
-        </w:tc>
-        <w:tc>
-          <w:tcPr/>
-          <w:p>
-            <w:pPr>
-              <w:pStyle w:val="Compact"/>
-            </w:pPr>
-            <w:r>
-              <w:t xml:space="preserve">PS5: Muscles &amp; Biomech [</w:t>
-            </w:r>
-            <w:hyperlink r:id="rId69">
-              <w:r>
-                <w:rPr>
-                  <w:rStyle w:val="Hyperlink"/>
-                </w:rPr>
-                <w:t xml:space="preserve">pdf</w:t>
               </w:r>
             </w:hyperlink>
             <w:r>

</xml_diff>

<commit_message>
fixed minor edits schedule
</commit_message>
<xml_diff>
--- a/docs/schedule.docx
+++ b/docs/schedule.docx
@@ -2206,14 +2206,6 @@
             <w:pPr>
               <w:pStyle w:val="Compact"/>
             </w:pPr>
-          </w:p>
-        </w:tc>
-        <w:tc>
-          <w:tcPr/>
-          <w:p>
-            <w:pPr>
-              <w:pStyle w:val="Compact"/>
-            </w:pPr>
             <w:r>
               <w:t xml:space="preserve">Design 2 Feeding &amp; Digestion [</w:t>
             </w:r>
@@ -2252,6 +2244,14 @@
             </w:r>
           </w:p>
         </w:tc>
+        <w:tc>
+          <w:tcPr/>
+          <w:p>
+            <w:pPr>
+              <w:pStyle w:val="Compact"/>
+            </w:pPr>
+          </w:p>
+        </w:tc>
       </w:tr>
       <w:tr>
         <w:tc>
@@ -2675,7 +2675,7 @@
                 <w:rPr>
                   <w:rStyle w:val="Hyperlink"/>
                 </w:rPr>
-                <w:t xml:space="preserve">Due Monday midnight</w:t>
+                <w:t xml:space="preserve">Due midnight</w:t>
               </w:r>
             </w:hyperlink>
             <w:r>

</xml_diff>